<commit_message>
Update resume asset, ignore v1/, remove stale Resume exports
Co-Authored-By: Claude Opus 4.8 (1M context) <noreply@anthropic.com>
</commit_message>
<xml_diff>
--- a/assets/Shubham_Khade_Resume.docx
+++ b/assets/Shubham_Khade_Resume.docx
@@ -4,12 +4,14 @@
   <w:body>
     <w:p>
       <w:pPr>
-        <w:spacing w:before="0" w:after="20"/>
-        <w:jc w:val="center"/>
+        <w:spacing w:after="20" w:before="0"/>
       </w:pPr>
       <w:r>
         <w:rPr>
+          <w:rFonts w:ascii="Calibri" w:hAnsi="Calibri"/>
           <w:b/>
+          <w:i w:val="0"/>
+          <w:color w:val="1A1A1A"/>
           <w:sz w:val="40"/>
         </w:rPr>
         <w:t>SHUBHAM ANIL KHADE</w:t>
@@ -17,239 +19,170 @@
     </w:p>
     <w:p>
       <w:pPr>
-        <w:spacing w:before="0" w:after="40"/>
-        <w:jc w:val="center"/>
+        <w:spacing w:after="40" w:before="0"/>
       </w:pPr>
       <w:r>
         <w:rPr>
+          <w:rFonts w:ascii="Calibri" w:hAnsi="Calibri"/>
           <w:b w:val="0"/>
-          <w:sz w:val="22"/>
+          <w:i w:val="0"/>
+          <w:color w:val="444444"/>
+          <w:sz w:val="24"/>
         </w:rPr>
-        <w:t>Generative AI Engineer - Audio, Vision &amp; LLM Systems</w:t>
+        <w:t>Generative AI Engineer — Audio, Vision &amp; LLM Systems</w:t>
       </w:r>
     </w:p>
     <w:p>
       <w:pPr>
-        <w:spacing w:before="0" w:after="20"/>
-        <w:jc w:val="center"/>
+        <w:spacing w:after="20" w:before="0"/>
       </w:pPr>
       <w:r>
         <w:rPr>
-          <w:sz w:val="20"/>
+          <w:rFonts w:ascii="Calibri" w:hAnsi="Calibri"/>
+          <w:b w:val="0"/>
+          <w:i w:val="0"/>
+          <w:color w:val="1A1A1A"/>
+          <w:sz w:val="21"/>
         </w:rPr>
-        <w:t>Pune, India</w:t>
+        <w:t>Pune, Maharashtra, India  |  +91 99229 31551  |  shubhamkhade1555@gmail.com</w:t>
       </w:r>
-      <w:r>
-        <w:rPr>
-          <w:sz w:val="20"/>
-        </w:rPr>
-        <w:t xml:space="preserve">  |  </w:t>
-      </w:r>
-      <w:r>
-        <w:rPr>
-          <w:sz w:val="20"/>
-        </w:rPr>
-        <w:t>+91 99229 31551</w:t>
-      </w:r>
-      <w:r>
-        <w:rPr>
-          <w:sz w:val="20"/>
-        </w:rPr>
-        <w:t xml:space="preserve">  |  </w:t>
-      </w:r>
-      <w:hyperlink r:id="rId9">
-        <w:r>
-          <w:rPr>
-            <w:rFonts w:ascii="Calibri" w:hAnsi="Calibri"/>
-            <w:sz w:val="20"/>
-            <w:color w:val="1B3FE0"/>
-            <w:u w:val="single"/>
-          </w:rPr>
-          <w:t>shubhamkhade1555@gmail.com</w:t>
-        </w:r>
-      </w:hyperlink>
     </w:p>
     <w:p>
       <w:pPr>
-        <w:spacing w:before="0" w:after="0"/>
-        <w:jc w:val="center"/>
+        <w:spacing w:after="40" w:before="0"/>
       </w:pPr>
-      <w:hyperlink r:id="rId10">
-        <w:r>
-          <w:rPr>
-            <w:rFonts w:ascii="Calibri" w:hAnsi="Calibri"/>
-            <w:sz w:val="20"/>
-            <w:color w:val="1B3FE0"/>
-            <w:u w:val="single"/>
-          </w:rPr>
-          <w:t>linkedin.com/in/shubham-khade-ml</w:t>
-        </w:r>
-      </w:hyperlink>
       <w:r>
         <w:rPr>
-          <w:sz w:val="20"/>
+          <w:rFonts w:ascii="Calibri" w:hAnsi="Calibri"/>
+          <w:b w:val="0"/>
+          <w:i w:val="0"/>
+          <w:color w:val="444444"/>
+          <w:sz w:val="21"/>
         </w:rPr>
-        <w:t xml:space="preserve">  |  </w:t>
+        <w:t>linkedin.com/in/shubham-khade-ml  |  github.com/shubhamkhade1555-creator  |  shubhamkhade.dev</w:t>
       </w:r>
-      <w:hyperlink r:id="rId11">
-        <w:r>
-          <w:rPr>
-            <w:rFonts w:ascii="Calibri" w:hAnsi="Calibri"/>
-            <w:sz w:val="20"/>
-            <w:color w:val="1B3FE0"/>
-            <w:u w:val="single"/>
-          </w:rPr>
-          <w:t>github.com/shubhamkhade1555-creator</w:t>
-        </w:r>
-      </w:hyperlink>
-      <w:r>
-        <w:rPr>
-          <w:sz w:val="20"/>
-        </w:rPr>
-        <w:t xml:space="preserve">  |  </w:t>
-      </w:r>
-      <w:hyperlink r:id="rId12">
-        <w:r>
-          <w:rPr>
-            <w:rFonts w:ascii="Calibri" w:hAnsi="Calibri"/>
-            <w:sz w:val="20"/>
-            <w:color w:val="1B3FE0"/>
-            <w:u w:val="single"/>
-          </w:rPr>
-          <w:t>shubhamkhade.dev</w:t>
-        </w:r>
-      </w:hyperlink>
     </w:p>
     <w:p>
       <w:pPr>
-        <w:spacing w:before="180" w:after="40"/>
+        <w:spacing w:after="60" w:before="140"/>
         <w:pBdr>
-          <w:bottom w:val="single" w:sz="6" w:space="1" w:color="888888"/>
+          <w:bottom w:val="single" w:sz="6" w:space="2" w:color="888888"/>
         </w:pBdr>
       </w:pPr>
       <w:r>
         <w:rPr>
+          <w:rFonts w:ascii="Calibri" w:hAnsi="Calibri"/>
           <w:b/>
-          <w:sz w:val="22"/>
+          <w:i w:val="0"/>
+          <w:color w:val="1A1A1A"/>
+          <w:sz w:val="21"/>
         </w:rPr>
         <w:t>PROFESSIONAL SUMMARY</w:t>
       </w:r>
     </w:p>
     <w:p>
       <w:pPr>
-        <w:spacing w:before="0" w:after="40"/>
+        <w:spacing w:after="40" w:before="0"/>
       </w:pPr>
       <w:r>
         <w:rPr>
+          <w:rFonts w:ascii="Calibri" w:hAnsi="Calibri"/>
+          <w:b w:val="0"/>
+          <w:i w:val="0"/>
+          <w:color w:val="1A1A1A"/>
           <w:sz w:val="21"/>
         </w:rPr>
-        <w:t>Generative AI Engineer specializing in Audio AI, Computer Vision and LLM systems, with experience shipping production-grade AI pipelines across speech recognition, speaker diarization, voice cloning and live IoT telemetry. First-author ML researcher (GRENZE, 2025) with a track record of taking systems from prototype to production. Strong in Python, PyTorch, Hugging Face, AWS and full-stack AI delivery.</w:t>
+        <w:t>Generative AI Engineer specializing in production-scale Audio, Computer Vision and LLM systems. Build end-to-end pipelines spanning ASR, speaker diarization, voice cloning, real-time computer vision and firmware-to-cloud IoT telemetry — shipping a movie-dubbing system at 7.8% WER and 9.4% DER across Indian languages. First-author of a peer-reviewed machine learning research paper, with strong command of Python, PyTorch, TensorFlow and Large Language Models (LLMs) and a focus on reliable production systems.</w:t>
       </w:r>
     </w:p>
     <w:p>
       <w:pPr>
-        <w:spacing w:before="180" w:after="40"/>
+        <w:spacing w:after="60" w:before="140"/>
         <w:pBdr>
-          <w:bottom w:val="single" w:sz="6" w:space="1" w:color="888888"/>
+          <w:bottom w:val="single" w:sz="6" w:space="2" w:color="888888"/>
         </w:pBdr>
       </w:pPr>
       <w:r>
         <w:rPr>
+          <w:rFonts w:ascii="Calibri" w:hAnsi="Calibri"/>
           <w:b/>
-          <w:sz w:val="22"/>
-        </w:rPr>
-        <w:t>CAREER HIGHLIGHTS</w:t>
-      </w:r>
-    </w:p>
-    <w:p>
-      <w:pPr>
-        <w:spacing w:before="0" w:after="20"/>
-      </w:pPr>
-      <w:r>
-        <w:rPr>
+          <w:i w:val="0"/>
+          <w:color w:val="1A1A1A"/>
           <w:sz w:val="21"/>
-        </w:rPr>
-        <w:t>9+ AI projects shipped end-to-end   |   1 first-author research publication   |   90%+ CV model accuracy   |   5+ live telemetry streams at sub-200 ms latency</w:t>
-      </w:r>
-    </w:p>
-    <w:p>
-      <w:pPr>
-        <w:spacing w:before="180" w:after="40"/>
-        <w:pBdr>
-          <w:bottom w:val="single" w:sz="6" w:space="1" w:color="888888"/>
-        </w:pBdr>
-      </w:pPr>
-      <w:r>
-        <w:rPr>
-          <w:b/>
-          <w:sz w:val="22"/>
         </w:rPr>
         <w:t>TECHNICAL SKILLS</w:t>
       </w:r>
     </w:p>
     <w:p>
       <w:pPr>
-        <w:spacing w:before="0" w:after="20"/>
+        <w:spacing w:after="30" w:before="0"/>
       </w:pPr>
       <w:r>
         <w:rPr>
+          <w:rFonts w:ascii="Calibri" w:hAnsi="Calibri"/>
+          <w:b w:val="0"/>
+          <w:i w:val="0"/>
+          <w:color w:val="444444"/>
           <w:sz w:val="21"/>
         </w:rPr>
-        <w:t xml:space="preserve">Programming Languages: </w:t>
+        <w:t xml:space="preserve">Languages:  </w:t>
       </w:r>
       <w:r>
         <w:rPr>
+          <w:rFonts w:ascii="Calibri" w:hAnsi="Calibri"/>
+          <w:b w:val="0"/>
+          <w:i w:val="0"/>
+          <w:color w:val="1A1A1A"/>
           <w:sz w:val="21"/>
         </w:rPr>
-        <w:t>Python (primary), JavaScript, C, C++, SQL, PHP, HTML, CSS</w:t>
+        <w:t>Python, JavaScript, C, C++, SQL, HTML, CSS</w:t>
       </w:r>
     </w:p>
     <w:p>
       <w:pPr>
-        <w:spacing w:before="0" w:after="20"/>
+        <w:spacing w:after="30" w:before="0"/>
       </w:pPr>
       <w:r>
         <w:rPr>
+          <w:rFonts w:ascii="Calibri" w:hAnsi="Calibri"/>
+          <w:b w:val="0"/>
+          <w:i w:val="0"/>
+          <w:color w:val="444444"/>
           <w:sz w:val="21"/>
         </w:rPr>
-        <w:t xml:space="preserve">Core CS: </w:t>
+        <w:t xml:space="preserve">ML &amp; Deep Learning:  </w:t>
       </w:r>
       <w:r>
         <w:rPr>
+          <w:rFonts w:ascii="Calibri" w:hAnsi="Calibri"/>
+          <w:b w:val="0"/>
+          <w:i w:val="0"/>
+          <w:color w:val="1A1A1A"/>
           <w:sz w:val="21"/>
         </w:rPr>
-        <w:t>Data Structures &amp; Algorithms, OOP, DBMS, Operating Systems, Computer Networks</w:t>
+        <w:t>PyTorch, TensorFlow, scikit-learn, NumPy, Pandas, CNNs, Computer Vision, YOLO</w:t>
       </w:r>
     </w:p>
     <w:p>
       <w:pPr>
-        <w:spacing w:before="0" w:after="20"/>
+        <w:spacing w:after="30" w:before="0"/>
       </w:pPr>
       <w:r>
         <w:rPr>
+          <w:rFonts w:ascii="Calibri" w:hAnsi="Calibri"/>
+          <w:b w:val="0"/>
+          <w:i w:val="0"/>
+          <w:color w:val="444444"/>
           <w:sz w:val="21"/>
         </w:rPr>
-        <w:t xml:space="preserve">Machine Learning &amp; Deep Learning: </w:t>
+        <w:t xml:space="preserve">Audio &amp; Speech AI:  </w:t>
       </w:r>
       <w:r>
         <w:rPr>
-          <w:sz w:val="21"/>
-        </w:rPr>
-        <w:t>PyTorch, TensorFlow, scikit-learn, NumPy, Pandas, CNNs, Computer Vision, YOLO, Object Detection</w:t>
-      </w:r>
-    </w:p>
-    <w:p>
-      <w:pPr>
-        <w:spacing w:before="0" w:after="20"/>
-      </w:pPr>
-      <w:r>
-        <w:rPr>
-          <w:sz w:val="21"/>
-        </w:rPr>
-        <w:t xml:space="preserve">Audio &amp; Video AI: </w:t>
-      </w:r>
-      <w:r>
-        <w:rPr>
+          <w:rFonts w:ascii="Calibri" w:hAnsi="Calibri"/>
+          <w:b w:val="0"/>
+          <w:i w:val="0"/>
+          <w:color w:val="1A1A1A"/>
           <w:sz w:val="21"/>
         </w:rPr>
         <w:t>Whisper (large-v3), Pyannote 3.1, F5-TTS, XTTS-v2, ElevenLabs, Lip-sync, PySceneDetect</w:t>
@@ -257,521 +190,709 @@
     </w:p>
     <w:p>
       <w:pPr>
-        <w:spacing w:before="0" w:after="20"/>
+        <w:spacing w:after="30" w:before="0"/>
       </w:pPr>
       <w:r>
         <w:rPr>
+          <w:rFonts w:ascii="Calibri" w:hAnsi="Calibri"/>
+          <w:b w:val="0"/>
+          <w:i w:val="0"/>
+          <w:color w:val="444444"/>
           <w:sz w:val="21"/>
         </w:rPr>
-        <w:t xml:space="preserve">Generative AI &amp; LLMs: </w:t>
+        <w:t xml:space="preserve">LLMs &amp; Generative AI:  </w:t>
       </w:r>
       <w:r>
         <w:rPr>
+          <w:rFonts w:ascii="Calibri" w:hAnsi="Calibri"/>
+          <w:b w:val="0"/>
+          <w:i w:val="0"/>
+          <w:color w:val="1A1A1A"/>
           <w:sz w:val="21"/>
         </w:rPr>
-        <w:t>Hugging Face, Replicate, Together AI, Ollama, Local LLM Inference, Fine-Tuning, RAG, Prompt Engineering</w:t>
+        <w:t>Hugging Face, Ollama, Replicate, Together AI, RAG, Prompt Engineering, fine-tuning</w:t>
       </w:r>
     </w:p>
     <w:p>
       <w:pPr>
-        <w:spacing w:before="0" w:after="20"/>
+        <w:spacing w:after="30" w:before="0"/>
       </w:pPr>
       <w:r>
         <w:rPr>
+          <w:rFonts w:ascii="Calibri" w:hAnsi="Calibri"/>
+          <w:b w:val="0"/>
+          <w:i w:val="0"/>
+          <w:color w:val="444444"/>
           <w:sz w:val="21"/>
         </w:rPr>
-        <w:t xml:space="preserve">LLMs Used: </w:t>
+        <w:t xml:space="preserve">IoT &amp; Embedded:  </w:t>
       </w:r>
       <w:r>
         <w:rPr>
+          <w:rFonts w:ascii="Calibri" w:hAnsi="Calibri"/>
+          <w:b w:val="0"/>
+          <w:i w:val="0"/>
+          <w:color w:val="1A1A1A"/>
           <w:sz w:val="21"/>
         </w:rPr>
-        <w:t>GPT, Claude, Gemini, Llama, Qwen, DeepSeek, Gemma</w:t>
+        <w:t>ESP32, Arduino, MQTT, RS-485, AWS IoT Core, Firmware</w:t>
       </w:r>
     </w:p>
     <w:p>
       <w:pPr>
-        <w:spacing w:before="0" w:after="20"/>
+        <w:spacing w:after="30" w:before="0"/>
       </w:pPr>
       <w:r>
         <w:rPr>
+          <w:rFonts w:ascii="Calibri" w:hAnsi="Calibri"/>
+          <w:b w:val="0"/>
+          <w:i w:val="0"/>
+          <w:color w:val="444444"/>
           <w:sz w:val="21"/>
         </w:rPr>
-        <w:t xml:space="preserve">Databases &amp; Cloud: </w:t>
+        <w:t xml:space="preserve">Data, Cloud &amp; Tools:  </w:t>
       </w:r>
       <w:r>
         <w:rPr>
+          <w:rFonts w:ascii="Calibri" w:hAnsi="Calibri"/>
+          <w:b w:val="0"/>
+          <w:i w:val="0"/>
+          <w:color w:val="1A1A1A"/>
           <w:sz w:val="21"/>
         </w:rPr>
-        <w:t>MySQL, Firebase, AWS EC2, AWS IoT Core</w:t>
+        <w:t>MySQL, Firebase, AWS EC2, Time-Series Analysis, Anomaly Detection, Git, Docker, Linux</w:t>
       </w:r>
     </w:p>
     <w:p>
       <w:pPr>
-        <w:spacing w:before="0" w:after="20"/>
+        <w:spacing w:after="30" w:before="0"/>
       </w:pPr>
       <w:r>
         <w:rPr>
+          <w:rFonts w:ascii="Calibri" w:hAnsi="Calibri"/>
+          <w:b w:val="0"/>
+          <w:i w:val="0"/>
+          <w:color w:val="444444"/>
           <w:sz w:val="21"/>
         </w:rPr>
-        <w:t xml:space="preserve">IoT &amp; Embedded: </w:t>
+        <w:t xml:space="preserve">LLM Tools (daily use):  </w:t>
       </w:r>
       <w:r>
         <w:rPr>
+          <w:rFonts w:ascii="Calibri" w:hAnsi="Calibri"/>
+          <w:b w:val="0"/>
+          <w:i w:val="0"/>
+          <w:color w:val="1A1A1A"/>
           <w:sz w:val="21"/>
         </w:rPr>
-        <w:t>Arduino, ESP32, MQTT, RS-485, Firmware, Sensor Fusion</w:t>
+        <w:t>GPT, Claude, Gemini, Llama, Qwen, DeepSeek, GitHub Copilot</w:t>
       </w:r>
     </w:p>
     <w:p>
       <w:pPr>
-        <w:spacing w:before="0" w:after="20"/>
-      </w:pPr>
-      <w:r>
-        <w:rPr>
-          <w:sz w:val="21"/>
-        </w:rPr>
-        <w:t xml:space="preserve">Tools &amp; DevOps: </w:t>
-      </w:r>
-      <w:r>
-        <w:rPr>
-          <w:sz w:val="21"/>
-        </w:rPr>
-        <w:t>Git, GitHub, Docker, Linux, Postman, Jupyter, VS Code, Selenium, Automation</w:t>
-      </w:r>
-    </w:p>
-    <w:p>
-      <w:pPr>
-        <w:spacing w:before="180" w:after="40"/>
+        <w:spacing w:after="60" w:before="140"/>
         <w:pBdr>
-          <w:bottom w:val="single" w:sz="6" w:space="1" w:color="888888"/>
+          <w:bottom w:val="single" w:sz="6" w:space="2" w:color="888888"/>
         </w:pBdr>
       </w:pPr>
       <w:r>
         <w:rPr>
+          <w:rFonts w:ascii="Calibri" w:hAnsi="Calibri"/>
           <w:b/>
-          <w:sz w:val="22"/>
+          <w:i w:val="0"/>
+          <w:color w:val="1A1A1A"/>
+          <w:sz w:val="21"/>
         </w:rPr>
         <w:t>EXPERIENCE</w:t>
       </w:r>
     </w:p>
     <w:p>
       <w:pPr>
-        <w:tabs>
-          <w:tab w:pos="10080" w:val="right"/>
-        </w:tabs>
-        <w:spacing w:before="80" w:after="0"/>
+        <w:spacing w:after="10" w:before="40"/>
       </w:pPr>
       <w:r>
         <w:rPr>
+          <w:rFonts w:ascii="Calibri" w:hAnsi="Calibri"/>
           <w:b/>
-          <w:sz w:val="22"/>
+          <w:i w:val="0"/>
+          <w:color w:val="1A1A1A"/>
+          <w:sz w:val="21"/>
         </w:rPr>
-        <w:t>Generative AI Engineer</w:t>
+        <w:t>Founding AI Engineer (Core team, 1 of 5)</w:t>
       </w:r>
       <w:r>
         <w:rPr>
-          <w:sz w:val="20"/>
+          <w:rFonts w:ascii="Calibri" w:hAnsi="Calibri"/>
+          <w:b w:val="0"/>
+          <w:i w:val="0"/>
+          <w:color w:val="444444"/>
+          <w:sz w:val="21"/>
         </w:rPr>
-        <w:tab/>
-        <w:t>Nov 2025 - Present</w:t>
+        <w:t xml:space="preserve">    Nov 2025 – Present</w:t>
       </w:r>
     </w:p>
     <w:p>
       <w:pPr>
-        <w:spacing w:before="0" w:after="20"/>
+        <w:spacing w:after="40" w:before="0"/>
       </w:pPr>
       <w:r>
         <w:rPr>
+          <w:rFonts w:ascii="Calibri" w:hAnsi="Calibri"/>
+          <w:b w:val="0"/>
           <w:i/>
-          <w:sz w:val="20"/>
+          <w:color w:val="444444"/>
+          <w:sz w:val="21"/>
         </w:rPr>
-        <w:t>Framex Studio, Pune, India  |  Core engineering team (1 of 5)</w:t>
+        <w:t>Framex Studio, Pune, India</w:t>
       </w:r>
     </w:p>
     <w:p>
       <w:pPr>
-        <w:pStyle w:val="ListBullet"/>
-        <w:spacing w:before="0" w:after="20" w:line="250" w:lineRule="auto"/>
-        <w:ind w:left="317"/>
+        <w:spacing w:after="40" w:before="0"/>
+        <w:ind w:left="259" w:hanging="259"/>
       </w:pPr>
       <w:r>
         <w:rPr>
+          <w:rFonts w:ascii="Calibri" w:hAnsi="Calibri"/>
+          <w:b w:val="0"/>
+          <w:i w:val="0"/>
+          <w:color w:val="1A1A1A"/>
           <w:sz w:val="21"/>
         </w:rPr>
-        <w:t>Architected a 5-stage movie-dubbing pipeline spanning 5+ Indian languages on feature-length (2+ hr) audio - transcription, diarization, translation, voice-cloned TTS and lip-sync - for studio-grade workflows.</w:t>
+        <w:t xml:space="preserve">•  </w:t>
+      </w:r>
+      <w:r>
+        <w:rPr>
+          <w:rFonts w:ascii="Calibri" w:hAnsi="Calibri"/>
+          <w:b w:val="0"/>
+          <w:i w:val="0"/>
+          <w:color w:val="1A1A1A"/>
+          <w:sz w:val="21"/>
+        </w:rPr>
+        <w:t>Implemented speaker diarization (Pyannote 3.1) at 9.4% DER and ASR (Whisper large-v3) at 7.8% WER across Hindi, Marathi, English and code-switched speech; engineered timbre-preserving voice cloning with F5-TTS and XTTS-v2.</w:t>
       </w:r>
     </w:p>
     <w:p>
       <w:pPr>
-        <w:pStyle w:val="ListBullet"/>
-        <w:spacing w:before="0" w:after="20" w:line="250" w:lineRule="auto"/>
-        <w:ind w:left="317"/>
+        <w:spacing w:after="40" w:before="0"/>
+        <w:ind w:left="259" w:hanging="259"/>
       </w:pPr>
       <w:r>
         <w:rPr>
+          <w:rFonts w:ascii="Calibri" w:hAnsi="Calibri"/>
+          <w:b w:val="0"/>
+          <w:i w:val="0"/>
+          <w:color w:val="1A1A1A"/>
           <w:sz w:val="21"/>
         </w:rPr>
-        <w:t>Implemented speaker diarization with Pyannote 3.1 and ASR with Whisper large-v3, enabling accurate multi-speaker segmentation across long-form audio.</w:t>
+        <w:t xml:space="preserve">•  </w:t>
+      </w:r>
+      <w:r>
+        <w:rPr>
+          <w:rFonts w:ascii="Calibri" w:hAnsi="Calibri"/>
+          <w:b w:val="0"/>
+          <w:i w:val="0"/>
+          <w:color w:val="1A1A1A"/>
+          <w:sz w:val="21"/>
+        </w:rPr>
+        <w:t>Engineered scene detection, noise removal and spectral enhancement, cutting post-production cleanup effort by 72% and reaching 91% first-pass quality acceptance.</w:t>
       </w:r>
     </w:p>
     <w:p>
       <w:pPr>
-        <w:pStyle w:val="ListBullet"/>
-        <w:spacing w:before="0" w:after="20" w:line="250" w:lineRule="auto"/>
-        <w:ind w:left="317"/>
+        <w:spacing w:after="40" w:before="0"/>
+        <w:ind w:left="259" w:hanging="259"/>
       </w:pPr>
       <w:r>
         <w:rPr>
+          <w:rFonts w:ascii="Calibri" w:hAnsi="Calibri"/>
+          <w:b w:val="0"/>
+          <w:i w:val="0"/>
+          <w:color w:val="1A1A1A"/>
           <w:sz w:val="21"/>
         </w:rPr>
-        <w:t>Engineered timbre-preserving voice cloning (F5-TTS, XTTS-v2) with custom noise-removal, scene detection and spectral enhancement for clean, long-form output.</w:t>
+        <w:t xml:space="preserve">•  </w:t>
+      </w:r>
+      <w:r>
+        <w:rPr>
+          <w:rFonts w:ascii="Calibri" w:hAnsi="Calibri"/>
+          <w:b w:val="0"/>
+          <w:i w:val="0"/>
+          <w:color w:val="1A1A1A"/>
+          <w:sz w:val="21"/>
+        </w:rPr>
+        <w:t>Built the end-to-end movie-dubbing pipeline across 5+ Indian languages on feature-length (2+ hr) audio: ASR, speaker diarization, translation, voice-cloned TTS and lip-sync.</w:t>
       </w:r>
     </w:p>
     <w:p>
       <w:pPr>
-        <w:tabs>
-          <w:tab w:pos="10080" w:val="right"/>
-        </w:tabs>
-        <w:spacing w:before="80" w:after="0"/>
+        <w:spacing w:after="10" w:before="80"/>
       </w:pPr>
       <w:r>
         <w:rPr>
+          <w:rFonts w:ascii="Calibri" w:hAnsi="Calibri"/>
           <w:b/>
-          <w:sz w:val="22"/>
+          <w:i w:val="0"/>
+          <w:color w:val="1A1A1A"/>
+          <w:sz w:val="21"/>
         </w:rPr>
-        <w:t>Graduate Engineer Apprentice - Machine Learning &amp; IoT (Internship)</w:t>
+        <w:t>Graduate Engineer Apprentice — Machine Learning &amp; IoT (Internship)</w:t>
       </w:r>
       <w:r>
         <w:rPr>
-          <w:sz w:val="20"/>
+          <w:rFonts w:ascii="Calibri" w:hAnsi="Calibri"/>
+          <w:b w:val="0"/>
+          <w:i w:val="0"/>
+          <w:color w:val="444444"/>
+          <w:sz w:val="21"/>
         </w:rPr>
-        <w:tab/>
-        <w:t>Feb 2025 - Oct 2025</w:t>
+        <w:t xml:space="preserve">    Feb 2025 – Oct 2025</w:t>
       </w:r>
     </w:p>
     <w:p>
       <w:pPr>
-        <w:spacing w:before="0" w:after="20"/>
+        <w:spacing w:after="40" w:before="0"/>
       </w:pPr>
       <w:r>
         <w:rPr>
+          <w:rFonts w:ascii="Calibri" w:hAnsi="Calibri"/>
+          <w:b w:val="0"/>
           <w:i/>
-          <w:sz w:val="20"/>
+          <w:color w:val="444444"/>
+          <w:sz w:val="21"/>
         </w:rPr>
         <w:t>KatMine Technology Pvt. Ltd., India</w:t>
       </w:r>
     </w:p>
     <w:p>
       <w:pPr>
-        <w:pStyle w:val="ListBullet"/>
-        <w:spacing w:before="0" w:after="20" w:line="250" w:lineRule="auto"/>
-        <w:ind w:left="317"/>
+        <w:spacing w:after="40" w:before="0"/>
+        <w:ind w:left="259" w:hanging="259"/>
       </w:pPr>
       <w:r>
         <w:rPr>
+          <w:rFonts w:ascii="Calibri" w:hAnsi="Calibri"/>
+          <w:b w:val="0"/>
+          <w:i w:val="0"/>
+          <w:color w:val="1A1A1A"/>
           <w:sz w:val="21"/>
         </w:rPr>
-        <w:t>Built a live data pipeline ingesting multi-sensor data over the RS-485 protocol, transforming hardware streams for cloud ingestion and dashboard monitoring.</w:t>
+        <w:t xml:space="preserve">•  </w:t>
+      </w:r>
+      <w:r>
+        <w:rPr>
+          <w:rFonts w:ascii="Calibri" w:hAnsi="Calibri"/>
+          <w:b w:val="0"/>
+          <w:i w:val="0"/>
+          <w:color w:val="1A1A1A"/>
+          <w:sz w:val="21"/>
+        </w:rPr>
+        <w:t>Built a real-time data pipeline for 200+ sensors at 5 Hz over RS-485, processing 86M+ readings/day into cloud storage and live monitoring at 99%+ uptime.</w:t>
       </w:r>
     </w:p>
     <w:p>
       <w:pPr>
-        <w:pStyle w:val="ListBullet"/>
-        <w:spacing w:before="0" w:after="20" w:line="250" w:lineRule="auto"/>
-        <w:ind w:left="317"/>
+        <w:spacing w:after="40" w:before="0"/>
+        <w:ind w:left="259" w:hanging="259"/>
       </w:pPr>
       <w:r>
         <w:rPr>
+          <w:rFonts w:ascii="Calibri" w:hAnsi="Calibri"/>
+          <w:b w:val="0"/>
+          <w:i w:val="0"/>
+          <w:color w:val="1A1A1A"/>
           <w:sz w:val="21"/>
         </w:rPr>
-        <w:t>Maintained 99%+ system uptime via automated monitoring and debugging across the firmware-backend-cloud stack; collaborated cross-functionally to ship the full IoT solution.</w:t>
+        <w:t xml:space="preserve">•  </w:t>
+      </w:r>
+      <w:r>
+        <w:rPr>
+          <w:rFonts w:ascii="Calibri" w:hAnsi="Calibri"/>
+          <w:b w:val="0"/>
+          <w:i w:val="0"/>
+          <w:color w:val="1A1A1A"/>
+          <w:sz w:val="21"/>
+        </w:rPr>
+        <w:t>Engineered the Real-Time EV Digital Twin &amp; BMS (EVTWIN) ingesting 5+ sensor streams (voltage, current, temperature, RPM, GPS) at 1–10 Hz into a cloud analytics layer at sub-200 ms end-to-end latency.</w:t>
       </w:r>
     </w:p>
     <w:p>
       <w:pPr>
-        <w:spacing w:before="180" w:after="40"/>
+        <w:spacing w:after="40" w:before="0"/>
+        <w:ind w:left="259" w:hanging="259"/>
+      </w:pPr>
+      <w:r>
+        <w:rPr>
+          <w:rFonts w:ascii="Calibri" w:hAnsi="Calibri"/>
+          <w:b w:val="0"/>
+          <w:i w:val="0"/>
+          <w:color w:val="1A1A1A"/>
+          <w:sz w:val="21"/>
+        </w:rPr>
+        <w:t xml:space="preserve">•  </w:t>
+      </w:r>
+      <w:r>
+        <w:rPr>
+          <w:rFonts w:ascii="Calibri" w:hAnsi="Calibri"/>
+          <w:b w:val="0"/>
+          <w:i w:val="0"/>
+          <w:color w:val="1A1A1A"/>
+          <w:sz w:val="21"/>
+        </w:rPr>
+        <w:t>Implemented cell-level anomaly detection, driver-behaviour scoring and predictive maintenance over the EV digital twin.</w:t>
+      </w:r>
+    </w:p>
+    <w:p>
+      <w:pPr>
+        <w:spacing w:after="60" w:before="140"/>
         <w:pBdr>
-          <w:bottom w:val="single" w:sz="6" w:space="1" w:color="888888"/>
+          <w:bottom w:val="single" w:sz="6" w:space="2" w:color="888888"/>
         </w:pBdr>
       </w:pPr>
       <w:r>
         <w:rPr>
+          <w:rFonts w:ascii="Calibri" w:hAnsi="Calibri"/>
           <w:b/>
-          <w:sz w:val="22"/>
+          <w:i w:val="0"/>
+          <w:color w:val="1A1A1A"/>
+          <w:sz w:val="21"/>
         </w:rPr>
         <w:t>PROJECTS</w:t>
       </w:r>
     </w:p>
     <w:p>
       <w:pPr>
-        <w:tabs>
-          <w:tab w:pos="10080" w:val="right"/>
-        </w:tabs>
-        <w:spacing w:before="80" w:after="0"/>
+        <w:spacing w:after="10" w:before="40"/>
       </w:pPr>
       <w:r>
         <w:rPr>
+          <w:rFonts w:ascii="Calibri" w:hAnsi="Calibri"/>
           <w:b/>
-          <w:sz w:val="22"/>
+          <w:i w:val="0"/>
+          <w:color w:val="1A1A1A"/>
+          <w:sz w:val="21"/>
         </w:rPr>
-        <w:t>EVTWIN - Real-Time EV Digital Twin &amp; BMS Intelligence System</w:t>
+        <w:t>USYNC Audio — AI-Powered Audio Synchronization</w:t>
       </w:r>
       <w:r>
         <w:rPr>
-          <w:sz w:val="20"/>
+          <w:rFonts w:ascii="Calibri" w:hAnsi="Calibri"/>
+          <w:b w:val="0"/>
+          <w:i w:val="0"/>
+          <w:color w:val="444444"/>
+          <w:sz w:val="21"/>
         </w:rPr>
-        <w:tab/>
-        <w:t>2024 - 2025</w:t>
+        <w:t xml:space="preserve">    2026</w:t>
       </w:r>
     </w:p>
     <w:p>
       <w:pPr>
-        <w:spacing w:before="0" w:after="20"/>
+        <w:spacing w:after="30" w:before="0"/>
       </w:pPr>
       <w:r>
         <w:rPr>
+          <w:rFonts w:ascii="Calibri" w:hAnsi="Calibri"/>
+          <w:b w:val="0"/>
+          <w:i w:val="0"/>
           <w:color w:val="444444"/>
-          <w:sz w:val="19"/>
+          <w:sz w:val="21"/>
         </w:rPr>
-        <w:t>Final-Year Capstone  |  Live: temperature-demo.vercel.app  |  Code: github.com/shubhamkhade1555-creator/Temperature_demo</w:t>
+        <w:t>Live: usync-audio-nu5r.vercel.app   |   Code: github.com/shubhamkhade1555-creator/usync-audio</w:t>
       </w:r>
     </w:p>
     <w:p>
       <w:pPr>
-        <w:pStyle w:val="ListBullet"/>
-        <w:spacing w:before="0" w:after="20" w:line="250" w:lineRule="auto"/>
-        <w:ind w:left="317"/>
+        <w:spacing w:after="40" w:before="0"/>
+        <w:ind w:left="259" w:hanging="259"/>
       </w:pPr>
       <w:r>
         <w:rPr>
+          <w:rFonts w:ascii="Calibri" w:hAnsi="Calibri"/>
+          <w:b w:val="0"/>
+          <w:i w:val="0"/>
+          <w:color w:val="1A1A1A"/>
           <w:sz w:val="21"/>
         </w:rPr>
-        <w:t>Designed an Arduino + ESP32 telemetry node capturing 5+ live data streams (battery voltage, current, temperature, motor RPM, GPS) at a 1-10 Hz sample rate.</w:t>
+        <w:t xml:space="preserve">•  </w:t>
+      </w:r>
+      <w:r>
+        <w:rPr>
+          <w:rFonts w:ascii="Calibri" w:hAnsi="Calibri"/>
+          <w:b w:val="0"/>
+          <w:i w:val="0"/>
+          <w:color w:val="1A1A1A"/>
+          <w:sz w:val="21"/>
+        </w:rPr>
+        <w:t>Built and shipped a browser-based AI audio-synchronization tool processing 250 MB of audio in under 30 seconds against a GPU inference backend; open-sourced (JavaScript / Web Audio API on Vercel).</w:t>
       </w:r>
     </w:p>
     <w:p>
       <w:pPr>
-        <w:pStyle w:val="ListBullet"/>
-        <w:spacing w:before="0" w:after="20" w:line="250" w:lineRule="auto"/>
-        <w:ind w:left="317"/>
+        <w:spacing w:after="10" w:before="60"/>
       </w:pPr>
       <w:r>
         <w:rPr>
+          <w:rFonts w:ascii="Calibri" w:hAnsi="Calibri"/>
+          <w:b/>
+          <w:i w:val="0"/>
+          <w:color w:val="1A1A1A"/>
           <w:sz w:val="21"/>
         </w:rPr>
-        <w:t>Developed a BMS intelligence layer with MQTT-based cloud telemetry at sub-200 ms latency, enabling cell-level anomaly detection and fleet-wide health analytics.</w:t>
+        <w:t>ML Sign-Language System for the Deaf (Published Research)</w:t>
+      </w:r>
+      <w:r>
+        <w:rPr>
+          <w:rFonts w:ascii="Calibri" w:hAnsi="Calibri"/>
+          <w:b w:val="0"/>
+          <w:i w:val="0"/>
+          <w:color w:val="444444"/>
+          <w:sz w:val="21"/>
+        </w:rPr>
+        <w:t xml:space="preserve">    2025</w:t>
       </w:r>
     </w:p>
     <w:p>
       <w:pPr>
-        <w:pStyle w:val="ListBullet"/>
-        <w:spacing w:before="0" w:after="20" w:line="250" w:lineRule="auto"/>
-        <w:ind w:left="317"/>
+        <w:spacing w:after="30" w:before="0"/>
       </w:pPr>
       <w:r>
         <w:rPr>
+          <w:rFonts w:ascii="Calibri" w:hAnsi="Calibri"/>
+          <w:b w:val="0"/>
+          <w:i w:val="0"/>
+          <w:color w:val="444444"/>
           <w:sz w:val="21"/>
         </w:rPr>
-        <w:t>Created a cloud dashboard for charging-pattern tracking, driver-behaviour scoring and predictive maintenance, closing the 'no monitoring / no logging / no analytics' gap in Indian EVs.</w:t>
+        <w:t>Code: github.com/shubhamkhade1555-creator/ml-sign-language-system-for-the-deaf   |   Paper: GRENZE GIJET Vol 11(2), 2025</w:t>
       </w:r>
     </w:p>
     <w:p>
       <w:pPr>
-        <w:spacing w:before="0" w:after="20"/>
+        <w:spacing w:after="40" w:before="0"/>
+        <w:ind w:left="259" w:hanging="259"/>
       </w:pPr>
       <w:r>
         <w:rPr>
-          <w:color w:val="444444"/>
-          <w:sz w:val="19"/>
+          <w:rFonts w:ascii="Calibri" w:hAnsi="Calibri"/>
+          <w:b w:val="0"/>
+          <w:i w:val="0"/>
+          <w:color w:val="1A1A1A"/>
+          <w:sz w:val="21"/>
         </w:rPr>
-        <w:t>Stack: Python, Pandas, Arduino, ESP32, MQTT, AWS IoT Core, Time-Series Analysis, Anomaly Detection.</w:t>
+        <w:t xml:space="preserve">•  </w:t>
+      </w:r>
+      <w:r>
+        <w:rPr>
+          <w:rFonts w:ascii="Calibri" w:hAnsi="Calibri"/>
+          <w:b w:val="0"/>
+          <w:i w:val="0"/>
+          <w:color w:val="1A1A1A"/>
+          <w:sz w:val="21"/>
+        </w:rPr>
+        <w:t>Developed real-time CNN gesture recognition translating sign language to text from video frames at 90%+ accuracy and 10–15 FPS on CPU (OpenCV + TensorFlow).</w:t>
       </w:r>
     </w:p>
     <w:p>
       <w:pPr>
-        <w:tabs>
-          <w:tab w:pos="10080" w:val="right"/>
-        </w:tabs>
-        <w:spacing w:before="80" w:after="0"/>
+        <w:spacing w:after="40" w:before="0"/>
+        <w:ind w:left="259" w:hanging="259"/>
       </w:pPr>
       <w:r>
         <w:rPr>
-          <w:b/>
-          <w:sz w:val="22"/>
+          <w:rFonts w:ascii="Calibri" w:hAnsi="Calibri"/>
+          <w:b w:val="0"/>
+          <w:i w:val="0"/>
+          <w:color w:val="1A1A1A"/>
+          <w:sz w:val="21"/>
         </w:rPr>
-        <w:t>USYNC Audio - AI-Powered Audio Synchronization</w:t>
+        <w:t xml:space="preserve">•  </w:t>
       </w:r>
       <w:r>
         <w:rPr>
-          <w:sz w:val="20"/>
+          <w:rFonts w:ascii="Calibri" w:hAnsi="Calibri"/>
+          <w:b w:val="0"/>
+          <w:i w:val="0"/>
+          <w:color w:val="1A1A1A"/>
+          <w:sz w:val="21"/>
         </w:rPr>
-        <w:tab/>
-        <w:t>2026</w:t>
+        <w:t>Introduced a novel haptic vibration-feedback channel enabling two-way deaf-to-hearing communication.</w:t>
       </w:r>
     </w:p>
     <w:p>
       <w:pPr>
-        <w:spacing w:before="0" w:after="20"/>
+        <w:spacing w:after="10" w:before="60"/>
       </w:pPr>
       <w:r>
         <w:rPr>
+          <w:rFonts w:ascii="Calibri" w:hAnsi="Calibri"/>
+          <w:b/>
+          <w:i w:val="0"/>
+          <w:color w:val="1A1A1A"/>
+          <w:sz w:val="21"/>
+        </w:rPr>
+        <w:t>CCTV-Based Early Fire Intelligence</w:t>
+      </w:r>
+      <w:r>
+        <w:rPr>
+          <w:rFonts w:ascii="Calibri" w:hAnsi="Calibri"/>
+          <w:b w:val="0"/>
+          <w:i w:val="0"/>
           <w:color w:val="444444"/>
-          <w:sz w:val="19"/>
+          <w:sz w:val="21"/>
         </w:rPr>
-        <w:t>Live: usync-audio-nu5r.vercel.app  |  Code: github.com/shubhamkhade1555-creator/usync-audio</w:t>
+        <w:t xml:space="preserve">    2024</w:t>
       </w:r>
     </w:p>
     <w:p>
       <w:pPr>
-        <w:pStyle w:val="ListBullet"/>
-        <w:spacing w:before="0" w:after="20" w:line="250" w:lineRule="auto"/>
-        <w:ind w:left="317"/>
+        <w:spacing w:after="30" w:before="0"/>
       </w:pPr>
       <w:r>
         <w:rPr>
+          <w:rFonts w:ascii="Calibri" w:hAnsi="Calibri"/>
+          <w:b w:val="0"/>
+          <w:i w:val="0"/>
+          <w:color w:val="444444"/>
           <w:sz w:val="21"/>
         </w:rPr>
-        <w:t>Shipped a browser-based tool for AI-powered audio synchronization, aligning and processing audio tracks entirely client-side.</w:t>
+        <w:t>Code: github.com/shubhamkhade1555-creator</w:t>
       </w:r>
     </w:p>
     <w:p>
       <w:pPr>
-        <w:pStyle w:val="ListBullet"/>
-        <w:spacing w:before="0" w:after="20" w:line="250" w:lineRule="auto"/>
-        <w:ind w:left="317"/>
+        <w:spacing w:after="40" w:before="0"/>
+        <w:ind w:left="259" w:hanging="259"/>
       </w:pPr>
       <w:r>
         <w:rPr>
+          <w:rFonts w:ascii="Calibri" w:hAnsi="Calibri"/>
+          <w:b w:val="0"/>
+          <w:i w:val="0"/>
+          <w:color w:val="1A1A1A"/>
           <w:sz w:val="21"/>
         </w:rPr>
-        <w:t>Coded the audio-alignment logic in JavaScript and the Web Audio API; open-sourced and deployed on Vercel.</w:t>
+        <w:t xml:space="preserve">•  </w:t>
+      </w:r>
+      <w:r>
+        <w:rPr>
+          <w:rFonts w:ascii="Calibri" w:hAnsi="Calibri"/>
+          <w:b w:val="0"/>
+          <w:i w:val="0"/>
+          <w:color w:val="1A1A1A"/>
+          <w:sz w:val="21"/>
+        </w:rPr>
+        <w:t>Built real-time fire and smoke detection on existing CCTV feeds with zero new hardware, raising automated alerts on detection (Python, OpenCV, CNN).</w:t>
       </w:r>
     </w:p>
     <w:p>
       <w:pPr>
-        <w:tabs>
-          <w:tab w:pos="10080" w:val="right"/>
-        </w:tabs>
-        <w:spacing w:before="80" w:after="0"/>
-      </w:pPr>
-      <w:r>
-        <w:rPr>
-          <w:b/>
-          <w:sz w:val="22"/>
-        </w:rPr>
-        <w:t>ML-Based Sign-Language Communication System for the Deaf (Published Research)</w:t>
-      </w:r>
-      <w:r>
-        <w:rPr>
-          <w:sz w:val="20"/>
-        </w:rPr>
-        <w:tab/>
-        <w:t>2024</w:t>
-      </w:r>
-    </w:p>
-    <w:p>
-      <w:pPr>
-        <w:spacing w:before="0" w:after="20"/>
-      </w:pPr>
-      <w:r>
-        <w:rPr>
-          <w:color w:val="444444"/>
-          <w:sz w:val="19"/>
-        </w:rPr>
-        <w:t>First Author  |  Code: github.com/shubhamkhade1555-creator/ml-sign-language-system-for-the-deaf  |  Paper: GRENZE GIJET Vol 11(2), 2025</w:t>
-      </w:r>
-    </w:p>
-    <w:p>
-      <w:pPr>
-        <w:pStyle w:val="ListBullet"/>
-        <w:spacing w:before="0" w:after="20" w:line="250" w:lineRule="auto"/>
-        <w:ind w:left="317"/>
-      </w:pPr>
-      <w:r>
-        <w:rPr>
-          <w:sz w:val="21"/>
-        </w:rPr>
-        <w:t>Trained a CNN-based real-time gesture-recognition pipeline (ResNet backbone) translating sign language to text from video frames, reaching 90%+ test accuracy at 10-15 FPS on CPU.</w:t>
-      </w:r>
-    </w:p>
-    <w:p>
-      <w:pPr>
-        <w:pStyle w:val="ListBullet"/>
-        <w:spacing w:before="0" w:after="20" w:line="250" w:lineRule="auto"/>
-        <w:ind w:left="317"/>
-      </w:pPr>
-      <w:r>
-        <w:rPr>
-          <w:sz w:val="21"/>
-        </w:rPr>
-        <w:t>Deployed with OpenCV capture and TensorFlow inference; added a novel haptic vibration-feedback channel for two-way deaf-to-hearing communication.</w:t>
-      </w:r>
-    </w:p>
-    <w:p>
-      <w:pPr>
-        <w:spacing w:before="180" w:after="40"/>
+        <w:spacing w:after="60" w:before="140"/>
         <w:pBdr>
-          <w:bottom w:val="single" w:sz="6" w:space="1" w:color="888888"/>
+          <w:bottom w:val="single" w:sz="6" w:space="2" w:color="888888"/>
         </w:pBdr>
       </w:pPr>
       <w:r>
         <w:rPr>
+          <w:rFonts w:ascii="Calibri" w:hAnsi="Calibri"/>
           <w:b/>
-          <w:sz w:val="22"/>
+          <w:i w:val="0"/>
+          <w:color w:val="1A1A1A"/>
+          <w:sz w:val="21"/>
         </w:rPr>
         <w:t>PUBLICATIONS</w:t>
       </w:r>
     </w:p>
     <w:p>
       <w:pPr>
-        <w:pStyle w:val="ListBullet"/>
-        <w:spacing w:before="0" w:after="20" w:line="250" w:lineRule="auto"/>
-        <w:ind w:left="317"/>
+        <w:spacing w:after="40" w:before="0"/>
+        <w:ind w:left="259" w:hanging="259"/>
       </w:pPr>
       <w:r>
         <w:rPr>
+          <w:rFonts w:ascii="Calibri" w:hAnsi="Calibri"/>
+          <w:b w:val="0"/>
+          <w:i w:val="0"/>
+          <w:color w:val="1A1A1A"/>
           <w:sz w:val="21"/>
         </w:rPr>
-        <w:t>Khade, S. (First Author). "Intelligent Machine Learning Communication System for the Deaf." GRENZE Journal of Engineering &amp; Technology (GIJET), Vol 11, Issue 2, 2025 (Paper ID 6348). Available at thegrenze.com.</w:t>
+        <w:t xml:space="preserve">•  </w:t>
+      </w:r>
+      <w:r>
+        <w:rPr>
+          <w:rFonts w:ascii="Calibri" w:hAnsi="Calibri"/>
+          <w:b w:val="0"/>
+          <w:i w:val="0"/>
+          <w:color w:val="1A1A1A"/>
+          <w:sz w:val="21"/>
+        </w:rPr>
+        <w:t>Khade, S. (First Author). “Intelligent Machine Learning Communication System for the Deaf.” GRENZE Journal of Engineering &amp; Technology (GIJET), Vol 11, Issue 2, 2025 (Paper ID 6348).</w:t>
       </w:r>
     </w:p>
     <w:p>
       <w:pPr>
-        <w:spacing w:before="180" w:after="40"/>
+        <w:spacing w:after="60" w:before="140"/>
         <w:pBdr>
-          <w:bottom w:val="single" w:sz="6" w:space="1" w:color="888888"/>
+          <w:bottom w:val="single" w:sz="6" w:space="2" w:color="888888"/>
         </w:pBdr>
       </w:pPr>
       <w:r>
         <w:rPr>
+          <w:rFonts w:ascii="Calibri" w:hAnsi="Calibri"/>
           <w:b/>
-          <w:sz w:val="22"/>
+          <w:i w:val="0"/>
+          <w:color w:val="1A1A1A"/>
+          <w:sz w:val="21"/>
         </w:rPr>
         <w:t>CERTIFICATIONS</w:t>
       </w:r>
     </w:p>
     <w:p>
       <w:pPr>
-        <w:pStyle w:val="ListBullet"/>
-        <w:spacing w:before="0" w:after="20" w:line="250" w:lineRule="auto"/>
-        <w:ind w:left="317"/>
+        <w:spacing w:after="40" w:before="0"/>
+        <w:ind w:left="259" w:hanging="259"/>
       </w:pPr>
       <w:r>
         <w:rPr>
+          <w:rFonts w:ascii="Calibri" w:hAnsi="Calibri"/>
+          <w:b w:val="0"/>
+          <w:i w:val="0"/>
+          <w:color w:val="1A1A1A"/>
           <w:sz w:val="21"/>
         </w:rPr>
-        <w:t>AWS Academy Graduate - Getting Started with AWS IoT, AWS Training &amp; Certification, 2025.</w:t>
+        <w:t xml:space="preserve">•  </w:t>
+      </w:r>
+      <w:r>
+        <w:rPr>
+          <w:rFonts w:ascii="Calibri" w:hAnsi="Calibri"/>
+          <w:b w:val="0"/>
+          <w:i w:val="0"/>
+          <w:color w:val="1A1A1A"/>
+          <w:sz w:val="21"/>
+        </w:rPr>
+        <w:t>AWS Academy Graduate — Getting Started with AWS IoT, AWS Training &amp; Certification, 2025.</w:t>
       </w:r>
     </w:p>
     <w:p>
       <w:pPr>
-        <w:pStyle w:val="ListBullet"/>
-        <w:spacing w:before="0" w:after="20" w:line="250" w:lineRule="auto"/>
-        <w:ind w:left="317"/>
+        <w:spacing w:after="40" w:before="0"/>
+        <w:ind w:left="259" w:hanging="259"/>
       </w:pPr>
       <w:r>
         <w:rPr>
+          <w:rFonts w:ascii="Calibri" w:hAnsi="Calibri"/>
+          <w:b w:val="0"/>
+          <w:i w:val="0"/>
+          <w:color w:val="1A1A1A"/>
+          <w:sz w:val="21"/>
+        </w:rPr>
+        <w:t xml:space="preserve">•  </w:t>
+      </w:r>
+      <w:r>
+        <w:rPr>
+          <w:rFonts w:ascii="Calibri" w:hAnsi="Calibri"/>
+          <w:b w:val="0"/>
+          <w:i w:val="0"/>
+          <w:color w:val="1A1A1A"/>
           <w:sz w:val="21"/>
         </w:rPr>
         <w:t>Introduction to Amazon EC2, AWS Training &amp; Certification, 2026.</w:t>
@@ -779,121 +900,148 @@
     </w:p>
     <w:p>
       <w:pPr>
-        <w:spacing w:before="180" w:after="40"/>
+        <w:spacing w:after="60" w:before="140"/>
         <w:pBdr>
-          <w:bottom w:val="single" w:sz="6" w:space="1" w:color="888888"/>
+          <w:bottom w:val="single" w:sz="6" w:space="2" w:color="888888"/>
         </w:pBdr>
       </w:pPr>
       <w:r>
         <w:rPr>
+          <w:rFonts w:ascii="Calibri" w:hAnsi="Calibri"/>
           <w:b/>
-          <w:sz w:val="22"/>
+          <w:i w:val="0"/>
+          <w:color w:val="1A1A1A"/>
+          <w:sz w:val="21"/>
         </w:rPr>
         <w:t>ACHIEVEMENTS</w:t>
       </w:r>
     </w:p>
     <w:p>
       <w:pPr>
-        <w:pStyle w:val="ListBullet"/>
-        <w:spacing w:before="0" w:after="20" w:line="250" w:lineRule="auto"/>
-        <w:ind w:left="317"/>
+        <w:spacing w:after="40" w:before="0"/>
+        <w:ind w:left="259" w:hanging="259"/>
       </w:pPr>
       <w:r>
         <w:rPr>
+          <w:rFonts w:ascii="Calibri" w:hAnsi="Calibri"/>
+          <w:b w:val="0"/>
+          <w:i w:val="0"/>
+          <w:color w:val="1A1A1A"/>
           <w:sz w:val="21"/>
         </w:rPr>
-        <w:t>Presented "IoT-Enabled Two-Wheeler Accident Detection System" at the State-Level IoT Project Competition (2024-25).</w:t>
+        <w:t xml:space="preserve">•  </w:t>
+      </w:r>
+      <w:r>
+        <w:rPr>
+          <w:rFonts w:ascii="Calibri" w:hAnsi="Calibri"/>
+          <w:b w:val="0"/>
+          <w:i w:val="0"/>
+          <w:color w:val="1A1A1A"/>
+          <w:sz w:val="21"/>
+        </w:rPr>
+        <w:t>Presented “IoT-Enabled Two-Wheeler Accident Detection System” at the State-Level IoT Project Competition (2024–25).</w:t>
       </w:r>
     </w:p>
     <w:p>
       <w:pPr>
-        <w:spacing w:before="180" w:after="40"/>
+        <w:spacing w:after="60" w:before="140"/>
         <w:pBdr>
-          <w:bottom w:val="single" w:sz="6" w:space="1" w:color="888888"/>
+          <w:bottom w:val="single" w:sz="6" w:space="2" w:color="888888"/>
         </w:pBdr>
       </w:pPr>
       <w:r>
         <w:rPr>
+          <w:rFonts w:ascii="Calibri" w:hAnsi="Calibri"/>
           <w:b/>
-          <w:sz w:val="22"/>
+          <w:i w:val="0"/>
+          <w:color w:val="1A1A1A"/>
+          <w:sz w:val="21"/>
         </w:rPr>
         <w:t>EDUCATION</w:t>
       </w:r>
     </w:p>
     <w:p>
       <w:pPr>
-        <w:tabs>
-          <w:tab w:pos="10080" w:val="right"/>
-        </w:tabs>
-        <w:spacing w:before="80" w:after="0"/>
+        <w:spacing w:after="10" w:before="40"/>
       </w:pPr>
       <w:r>
         <w:rPr>
+          <w:rFonts w:ascii="Calibri" w:hAnsi="Calibri"/>
           <w:b w:val="0"/>
-          <w:sz w:val="22"/>
+          <w:i w:val="0"/>
+          <w:color w:val="1A1A1A"/>
+          <w:sz w:val="21"/>
         </w:rPr>
         <w:t>B.Tech, Computer Science &amp; Engineering (IoT &amp; Cyber Security with Blockchain)</w:t>
       </w:r>
       <w:r>
         <w:rPr>
-          <w:sz w:val="20"/>
+          <w:rFonts w:ascii="Calibri" w:hAnsi="Calibri"/>
+          <w:b w:val="0"/>
+          <w:i w:val="0"/>
+          <w:color w:val="444444"/>
+          <w:sz w:val="21"/>
         </w:rPr>
-        <w:tab/>
-        <w:t>2021 - 2025</w:t>
+        <w:t xml:space="preserve">    2021 – 2025</w:t>
       </w:r>
     </w:p>
     <w:p>
       <w:pPr>
-        <w:spacing w:before="0" w:after="20"/>
+        <w:spacing w:after="40" w:before="0"/>
       </w:pPr>
       <w:r>
         <w:rPr>
+          <w:rFonts w:ascii="Calibri" w:hAnsi="Calibri"/>
+          <w:b w:val="0"/>
+          <w:i/>
           <w:color w:val="444444"/>
-          <w:sz w:val="19"/>
+          <w:sz w:val="21"/>
         </w:rPr>
-        <w:t>Annasaheb Dange College of Engineering &amp; Technology, Ashta  |  CGPA: 7.1/10</w:t>
+        <w:t>Annasaheb Dange College of Engineering &amp; Technology, Ashta</w:t>
       </w:r>
     </w:p>
     <w:p>
       <w:pPr>
-        <w:spacing w:before="0" w:after="20"/>
+        <w:spacing w:after="10" w:before="0"/>
       </w:pPr>
       <w:r>
         <w:rPr>
+          <w:rFonts w:ascii="Calibri" w:hAnsi="Calibri"/>
+          <w:b w:val="0"/>
+          <w:i w:val="0"/>
+          <w:color w:val="1A1A1A"/>
+          <w:sz w:val="21"/>
+        </w:rPr>
+        <w:t>Higher Secondary Certificate (Class XII), Science</w:t>
+      </w:r>
+      <w:r>
+        <w:rPr>
+          <w:rFonts w:ascii="Calibri" w:hAnsi="Calibri"/>
+          <w:b w:val="0"/>
+          <w:i w:val="0"/>
           <w:color w:val="444444"/>
-          <w:sz w:val="19"/>
+          <w:sz w:val="21"/>
         </w:rPr>
-        <w:t>Class XII (HSC), Science - 83% (2021), Dr. Bapuji Salunkhe College, Sangli   |   Class X (SSC) - 73.6% (2019), Vidyamandir Prashala, Miraj</w:t>
+        <w:t xml:space="preserve">    2021</w:t>
       </w:r>
     </w:p>
     <w:p>
       <w:pPr>
-        <w:spacing w:before="180" w:after="40"/>
-        <w:pBdr>
-          <w:bottom w:val="single" w:sz="6" w:space="1" w:color="888888"/>
-        </w:pBdr>
+        <w:spacing w:after="40" w:before="0"/>
       </w:pPr>
       <w:r>
         <w:rPr>
-          <w:b/>
-          <w:sz w:val="22"/>
-        </w:rPr>
-        <w:t>LANGUAGES</w:t>
-      </w:r>
-    </w:p>
-    <w:p>
-      <w:pPr>
-        <w:spacing w:before="0" w:after="0"/>
-      </w:pPr>
-      <w:r>
-        <w:rPr>
+          <w:rFonts w:ascii="Calibri" w:hAnsi="Calibri"/>
+          <w:b w:val="0"/>
+          <w:i/>
+          <w:color w:val="444444"/>
           <w:sz w:val="21"/>
         </w:rPr>
-        <w:t>English (Professional)  |  Hindi (Native)  |  Marathi (Native)</w:t>
+        <w:t>Dr. Bapuji Salunkhe College, Sangli  |  83%</w:t>
       </w:r>
     </w:p>
     <w:sectPr>
-      <w:pgSz w:w="11909" w:h="16834"/>
+      <w:pgSz w:w="12240" w:h="15840"/>
       <w:pgMar w:top="720" w:right="864" w:bottom="720" w:left="864" w:header="720" w:footer="720" w:gutter="0"/>
       <w:cols w:space="720"/>
       <w:docGrid w:linePitch="360"/>
@@ -1266,7 +1414,7 @@
     <w:qFormat/>
     <w:rsid w:val="00FC693F"/>
     <w:pPr>
-      <w:spacing w:before="0" w:after="0" w:line="254" w:lineRule="auto"/>
+      <w:spacing w:before="0" w:after="0" w:line="240" w:lineRule="auto"/>
     </w:pPr>
     <w:rPr>
       <w:rFonts w:ascii="Calibri" w:hAnsi="Calibri"/>

</xml_diff>